<commit_message>
fix(tree): restore floating toggle pill button (+N con) on parent tree nodes
</commit_message>
<xml_diff>
--- a/HUONG_DAN_SU_DUNG.docx
+++ b/HUONG_DAN_SU_DUNG.docx
@@ -827,7 +827,7 @@
         <w:rPr>
           <w:rFonts w:ascii="Arial" w:hAnsi="Arial"/>
         </w:rPr>
-        <w:t>Cho phép hình dung rõ ràng cấu trúc gia tộc theo từng nhánh, từng đời.</w:t>
+        <w:t>Cho phép hình dung rõ ràng cấu trúc gia tộc theo từng nhánh, từng đời. Toàn bộ cây phả hệ sẽ được hiển thị đầy đủ ngay từ ban đầu.</w:t>
       </w:r>
     </w:p>
     <w:p>
@@ -848,26 +848,6 @@
           <w:rFonts w:ascii="Arial" w:hAnsi="Arial"/>
         </w:rPr>
         <w:t>Sơ đồ đã được tối ưu hiển thị theo nguyên tắc truyền thống (từ Phải qua Trái): Vợ cả ➔ Vợ 2, Con trưởng ➔ Con út.</w:t>
-      </w:r>
-    </w:p>
-    <w:p>
-      <w:pPr>
-        <w:pStyle w:val="ListBullet"/>
-        <w:spacing w:after="60"/>
-      </w:pPr>
-      <w:r>
-        <w:rPr>
-          <w:rFonts w:ascii="Arial" w:hAnsi="Arial"/>
-          <w:b/>
-          <w:color w:val="006400"/>
-        </w:rPr>
-        <w:t xml:space="preserve">Đóng / Mở nhánh: </w:t>
-      </w:r>
-      <w:r>
-        <w:rPr>
-          <w:rFonts w:ascii="Arial" w:hAnsi="Arial"/>
-        </w:rPr>
-        <w:t>Sơ đồ ban đầu hiển thị rút gọn để dễ nhìn. Bạn có thể bấm nút mũi tên Lên/Xuống ở dưới mỗi người để Mở rộng hoặc Thu gọn các thế hệ con cháu của người đó.</w:t>
       </w:r>
     </w:p>
     <w:p>

</xml_diff>